<commit_message>
Update Notes for next version.docx
</commit_message>
<xml_diff>
--- a/DAQ_design/Assisi/v0.2.1/Notes for next version.docx
+++ b/DAQ_design/Assisi/v0.2.1/Notes for next version.docx
@@ -169,6 +169,61 @@
         <w:t>Add a 2-probe/4-probe switch to the PCB.</w:t>
       </w:r>
     </w:p>
+    <w:p>
+      <w:pPr>
+        <w:pStyle w:val="ListParagraph"/>
+        <w:numPr>
+          <w:ilvl w:val="0"/>
+          <w:numId w:val="1"/>
+        </w:numPr>
+      </w:pPr>
+      <w:r>
+        <w:t xml:space="preserve">Looks like AI0-3 connect to the CDAQ ports 7-4 (in that order), we need to fix these. </w:t>
+      </w:r>
+    </w:p>
+    <w:p>
+      <w:pPr>
+        <w:pStyle w:val="ListParagraph"/>
+        <w:numPr>
+          <w:ilvl w:val="0"/>
+          <w:numId w:val="1"/>
+        </w:numPr>
+      </w:pPr>
+      <w:r>
+        <w:t xml:space="preserve">Move components around so a </w:t>
+      </w:r>
+      <w:r>
+        <w:t>screwdriver</w:t>
+      </w:r>
+      <w:r>
+        <w:t xml:space="preserve"> can get to the </w:t>
+      </w:r>
+      <w:r>
+        <w:t>D</w:t>
+      </w:r>
+      <w:r>
+        <w:t>-sub screws.</w:t>
+      </w:r>
+    </w:p>
+    <w:p>
+      <w:pPr>
+        <w:pStyle w:val="ListParagraph"/>
+        <w:numPr>
+          <w:ilvl w:val="0"/>
+          <w:numId w:val="1"/>
+        </w:numPr>
+      </w:pPr>
+      <w:r>
+        <w:t xml:space="preserve">Add </w:t>
+      </w:r>
+      <w:r>
+        <w:t>an</w:t>
+      </w:r>
+      <w:r>
+        <w:t xml:space="preserve"> SN line to the silk screen, so we can add SNs in paint pens. </w:t>
+      </w:r>
+    </w:p>
+    <w:p/>
     <w:p/>
     <w:sectPr>
       <w:pgSz w:w="12240" w:h="15840"/>

</xml_diff>